<commit_message>
Match Plaintiffs' "UofL Defendants" convention in v2
Per the contemporaneous Pls' MPO and prior MTCs, references to
the moving defendants are styled "UofL Defendants" (no preceding
"the"), defined as ("UofL Defendants"), and treated as plural.

Replaced bare "UofL" / "the UofL Defendants" throughout the body
and adjusted verbs and pronouns to plural agreement. "UofL Health"
in the entity names preserved. Section headings retain all-caps
"UofL DEFENDANTS'".

https://claude.ai/code/session_01QYdnRSHjvp4HcEydyqek5r
</commit_message>
<xml_diff>
--- a/2026_06XX_Pls' resp to UofL Defs MPO v2.docx
+++ b/2026_06XX_Pls' resp to UofL Defs MPO v2.docx
@@ -500,7 +500,7 @@
         <w:pStyle w:val="BrfBdy"/>
       </w:pPr>
       <w:r>
-        <w:t>Plaintiffs, Charles Tinker, Individually and as Executor of the Estate of Thelma “Timmi” Tinker, et al., by counsel, submit this Response to the Motion for Protective Order filed by Defendants UofL Health–Louisville, Inc., University of Louisville Physicians, Inc., and UofL Health, Inc. (collectively, the “UofL Defendants”). For the reasons that follow, the Motion should be denied.</w:t>
+        <w:t>Plaintiffs, Charles Tinker, Individually and as Executor of the Estate of Thelma “Timmi” Tinker, et al., by counsel, submit this Response to the Motion for Protective Order filed by Defendants UofL Health–Louisville, Inc., University of Louisville Physicians, Inc., and UofL Health, Inc. (“UofL Defendants”). For the reasons that follow, the Motion should be denied.</w:t>
       </w:r>
     </w:p>
     <w:p>
@@ -513,7 +513,7 @@
           <w:b/>
           <w:u w:val="single"/>
         </w:rPr>
-        <w:t xml:space="preserve">INTRODUCTION</w:t>
+        <w:t>INTRODUCTION</w:t>
       </w:r>
     </w:p>
     <w:p>
@@ -529,7 +529,7 @@
         <w:pStyle w:val="BrfBdy"/>
       </w:pPr>
       <w:r>
-        <w:t>Plaintiffs’ CR 30.02(6) Notice is directed at how that failure happened inside UofL’s electronic health record systems. The Notice asks the UofL Defendants to designate witnesses on three categories of issues. First, the Notice asks how PET scan reports travel through UofL’s PACS, In-Basket, “acknowledgment,” and MyChart systems. Second, it asks how the audit data UofL has produced should be interpreted, and what that data does and does not show. Third, it asks UofL to identify the factual support for certain contentions UofL has placed at issue in this case. The companion CR 34 request asks UofL’s designees to demonstrate the answers by screen-sharing Timmi’s live chart on Zoom. That is the same way UofL’s providers and staff view the chart every day.</w:t>
+        <w:t>Plaintiffs’ CR 30.02(6) Notice is directed at how that failure happened inside UofL Defendants’ electronic health record systems. The Notice asks UofL Defendants to designate witnesses on three categories of issues. First, the Notice asks how PET scan reports travel through UofL Defendants’ PACS, In-Basket, “acknowledgment,” and MyChart systems. Second, it asks how the audit data UofL Defendants have produced should be interpreted, and what that data does and does not show. Third, it asks UofL Defendants to identify the factual support for certain contentions UofL Defendants have placed at issue in this case. The companion CR 34 request asks UofL Defendants’ designees to demonstrate the answers by screen-sharing Timmi’s live chart on Zoom. That is the same way UofL Defendants’ providers and staff view the chart every day.</w:t>
       </w:r>
     </w:p>
     <w:p>
@@ -537,7 +537,7 @@
         <w:pStyle w:val="BrfBdy"/>
       </w:pPr>
       <w:r>
-        <w:t>The UofL Defendants label this Notice a “fishing expedition.” That label does not survive scrutiny. The Notice is narrowly targeted at the central factual dispute in this case: whether and when Dr. Gettis and her practice actually saw, routed, and acted on the August 15, 2022 PET scan report. The timing of the Notice is also no accident. UofL is itself relying on its own audit trail to advance a defense that Timmi accessed her MyChart, learned of her cancer, and hid that diagnosis from her family. UofL cannot have it both ways. It cannot offer its audit trail as the foundation of an affirmative defense while preventing Plaintiffs from testing how that data was generated, what it actually shows, and what other audit information UofL has not produced. Should the Court grant the protective order UofL requests, fairness requires reciprocal relief: UofL should be precluded from using the audit trail to argue that Timmi viewed, read, or knew the substance of her PET scan results.</w:t>
+        <w:t>UofL Defendants label this Notice a “fishing expedition.” That label does not survive scrutiny. The Notice is narrowly targeted at the central factual dispute in this case: whether and when Dr. Gettis and her practice actually saw, routed, and acted on the August 15, 2022 PET scan report. The timing of the Notice is also no accident. UofL Defendants are themselves relying on their own audit trail to advance a defense that Timmi accessed her MyChart, learned of her cancer, and hid that diagnosis from her family. UofL Defendants cannot have it both ways. They cannot offer their audit trail as the foundation of an affirmative defense while preventing Plaintiffs from testing how that data was generated, what it actually shows, and what other audit information UofL Defendants have not produced. Should the Court grant the protective order UofL Defendants request, fairness requires reciprocal relief: UofL Defendants should be precluded from using the audit trail to argue that Timmi viewed, read, or knew the substance of her PET scan results.</w:t>
       </w:r>
     </w:p>
     <w:p>
@@ -545,7 +545,7 @@
         <w:pStyle w:val="BrfBdy"/>
       </w:pPr>
       <w:r>
-        <w:t>One last point at the outset. The UofL Defendants invoke meet-and-confer principles throughout their brief. Yet they filed this Motion only six days after Plaintiffs served the Notice, without a single telephone call, email, or letter raising specific objections. The Notice itself invited dialogue on both scheduling and substance, in two separate footnotes. Plaintiffs’ counsel remain prepared to discuss reasonable adjustments. The appropriate resolution here is for the parties to confer and proceed with the deposition and inspection on a workable schedule, not for the Court to enter a protective order shutting down what is plainly proper discovery.</w:t>
+        <w:t>One last point at the outset. UofL Defendants invoke meet-and-confer principles throughout their brief. Yet they filed this Motion only six days after Plaintiffs served the Notice, without a single telephone call, email, or letter raising specific objections. The Notice itself invited dialogue on both scheduling and substance, in two separate footnotes. Plaintiffs’ counsel remain prepared to discuss reasonable adjustments. The appropriate resolution here is for the parties to confer and proceed with the deposition and inspection on a workable schedule, not for the Court to enter a protective order shutting down what is plainly proper discovery.</w:t>
       </w:r>
     </w:p>
     <w:p>
@@ -558,7 +558,7 @@
           <w:b/>
           <w:u w:val="single"/>
         </w:rPr>
-        <w:t xml:space="preserve">BACKGROUND</w:t>
+        <w:t>BACKGROUND</w:t>
       </w:r>
     </w:p>
     <w:p>
@@ -574,7 +574,7 @@
         <w:pStyle w:val="BrfBdy"/>
       </w:pPr>
       <w:r>
-        <w:t>Nobody told Timmi. Dr. Gettis did not “acknowledge” the August 15, 2022 PET scan report in UofL’s electronic health record until April 24, 2024. That was the same day Timmi came in for her annual physical, and the same day Dr. Gettis sent Timmi home without mentioning the result. Between August 2022 and April 2024, Timmi interacted with Dr. Gettis’s office repeatedly: for prescription refills, MyChart messages, an annual physical with a nurse practitioner, ear cerumen removal, and mammogram results. At every interaction, the PET scan report sat in Timmi’s chart. Nobody flagged it. Timmi was finally diagnosed with cancer on May 9, 2024 in the emergency department. She died eight days later.</w:t>
+        <w:t>Nobody told Timmi. Dr. Gettis did not “acknowledge” the August 15, 2022 PET scan report in UofL Defendants’ electronic health record until April 24, 2024. That was the same day Timmi came in for her annual physical, and the same day Dr. Gettis sent Timmi home without mentioning the result. Between August 2022 and April 2024, Timmi interacted with Dr. Gettis’s office repeatedly: for prescription refills, MyChart messages, an annual physical with a nurse practitioner, ear cerumen removal, and mammogram results. At every interaction, the PET scan report sat in Timmi’s chart. Nobody flagged it. Timmi was finally diagnosed with cancer on May 9, 2024 in the emergency department. She died eight days later.</w:t>
       </w:r>
     </w:p>
     <w:p>
@@ -588,7 +588,7 @@
         <w:t xml:space="preserve">The CR 30.02(6) Notice. </w:t>
       </w:r>
       <w:r>
-        <w:t>On May 22, 2026, Plaintiffs served the CR 30.02(6) Notice attached to the Motion as Exhibit 1. The Notice identifies eighteen specific topics, all directed to Timmi’s August 15, 2022 PET scan and the EHR functionality that handled it. Among other things, the Notice asks (1) how the PET scan report moved from the PACS into Dr. Gettis’s In-Basket; (2) how the In-Basket and “acknowledgment” functions work; (3) how the August 15, 2022 PET scan was, or was not, released to Timmi’s MyChart; (4) what the audit trail UofL produced does and does not capture; and (5) whether UofL contends that Dr. Gettis read the August 15, 2022 PET scan, and if so on what basis. The Notice also expressly invited counsel to confer on both the date and the scope of the topics.</w:t>
+        <w:t>On May 22, 2026, Plaintiffs served the CR 30.02(6) Notice attached to the Motion as Exhibit 1. The Notice identifies eighteen specific topics, all directed to Timmi’s August 15, 2022 PET scan and the EHR functionality that handled it. Among other things, the Notice asks (1) how the PET scan report moved from the PACS into Dr. Gettis’s In-Basket; (2) how the In-Basket and “acknowledgment” functions work; (3) how the August 15, 2022 PET scan was, or was not, released to Timmi’s MyChart; (4) what the audit trail UofL Defendants produced does and does not capture; and (5) whether UofL Defendants contend that Dr. Gettis read the August 15, 2022 PET scan, and if so on what basis. The Notice also expressly invited counsel to confer on both the date and the scope of the topics.</w:t>
       </w:r>
     </w:p>
     <w:p>
@@ -599,10 +599,10 @@
         <w:rPr>
           <w:i/>
         </w:rPr>
-        <w:t xml:space="preserve">The audit trail and its use by the UofL Defendants. </w:t>
-      </w:r>
-      <w:r>
-        <w:t>UofL has produced what it describes as the “audit trail” for Timmi’s electronic medical record. On its face, the audit trail is ambiguous. For example, a single entry from August 18, 2022 reads “Order details viewed,” with associated data of “PET/CT BONE SKULL BASE TO MID THIGH.” Another entry from that afternoon states “Printing occurred in MyChart,” with associated data of only “Web page name Test Details.” Without testimony from a UofL designee who can explain what these entries actually mean within UofL’s system, and without the ability to see how the system behaves when these events occur, the entries are open to multiple interpretations.</w:t>
+        <w:t xml:space="preserve">The audit trail and its use by UofL Defendants. </w:t>
+      </w:r>
+      <w:r>
+        <w:t>UofL Defendants have produced what they describe as the “audit trail” for Timmi’s electronic medical record. On its face, the audit trail is ambiguous. For example, a single entry from August 18, 2022 reads “Order details viewed,” with associated data of “PET/CT BONE SKULL BASE TO MID THIGH.” Another entry from that afternoon states “Printing occurred in MyChart,” with associated data of only “Web page name Test Details.” Without testimony from a designee of UofL Defendants who can explain what these entries actually mean within UofL Defendants’ system, and without the ability to see how the system behaves when these events occur, the entries are open to multiple interpretations.</w:t>
       </w:r>
     </w:p>
     <w:p>
@@ -610,7 +610,7 @@
         <w:pStyle w:val="BrfBdy"/>
       </w:pPr>
       <w:r>
-        <w:t>Despite the ambiguity, UofL has signaled its intent to rely on the audit trail to support a defense that Timmi accessed her MyChart, read the PET scan report, and concealed her diagnosis from her family. UofL has recently served written discovery demanding production of all browser history, internet search history, URL logs, Google account data, and related digital data from any device used by Timmi between July 2022 and May 2024. The sole stated foundation for those demands is the audit trail. Plaintiffs are filing a separate Motion for Protective Order with respect to that browsing-history discovery, and incorporate that motion here by reference.</w:t>
+        <w:t>Despite the ambiguity, UofL Defendants have signaled their intent to rely on the audit trail to support a defense that Timmi accessed her MyChart, read the PET scan report, and concealed her diagnosis from her family. UofL Defendants have recently served written discovery demanding production of all browser history, internet search history, URL logs, Google account data, and related digital data from any device used by Timmi between July 2022 and May 2024. The sole stated foundation for those demands is the audit trail. Plaintiffs are filing a separate Motion for Protective Order with respect to that browsing-history discovery, and incorporate that motion here by reference.</w:t>
       </w:r>
     </w:p>
     <w:p>
@@ -624,7 +624,7 @@
         <w:t xml:space="preserve">No meet and confer occurred. </w:t>
       </w:r>
       <w:r>
-        <w:t>The Notice itself invited dialogue. The first footnote stated: “If the date selected does not work for witness or counsel, please contact the undersigned, and we will adjust to a date within the court-ordered due dates.” The second footnote stated: “Counsel are prepared to discuss and attempt to resolve any disagreement as to scope or content of the Topics; please contact the undersigned as soon as convenient should that be necessary.” Plaintiffs’ counsel separately reached out to defense counsel after serving the Notice to discuss reasonable adjustments. UofL nevertheless filed this Motion six days after the Notice was served, without ever raising specific objections.</w:t>
+        <w:t>The Notice itself invited dialogue. The first footnote stated: “If the date selected does not work for witness or counsel, please contact the undersigned, and we will adjust to a date within the court-ordered due dates.” The second footnote stated: “Counsel are prepared to discuss and attempt to resolve any disagreement as to scope or content of the Topics; please contact the undersigned as soon as convenient should that be necessary.” Plaintiffs’ counsel separately reached out to defense counsel after serving the Notice to discuss reasonable adjustments. UofL Defendants nevertheless filed this Motion six days after the Notice was served, without ever raising specific objections.</w:t>
       </w:r>
     </w:p>
     <w:p>
@@ -637,7 +637,7 @@
           <w:b/>
           <w:u w:val="single"/>
         </w:rPr>
-        <w:t xml:space="preserve">ARGUMENT</w:t>
+        <w:t>ARGUMENT</w:t>
       </w:r>
     </w:p>
     <w:p>
@@ -649,14 +649,15 @@
           <w:b/>
           <w:u w:val="single"/>
         </w:rPr>
-        <w:t xml:space="preserve">I.	</w:t>
+        <w:t>I.</w:t>
+        <w:tab/>
       </w:r>
       <w:r>
         <w:rPr>
           <w:b/>
           <w:u w:val="single"/>
         </w:rPr>
-        <w:t xml:space="preserve">THE 30.02(6) TOPICS ARE PROPERLY TAILORED TO THE CENTRAL ISSUES IN THIS CASE.</w:t>
+        <w:t>THE 30.02(6) TOPICS ARE PROPERLY TAILORED TO THE CENTRAL ISSUES IN THIS CASE.</w:t>
       </w:r>
     </w:p>
     <w:p>
@@ -664,7 +665,7 @@
         <w:pStyle w:val="BrfBdy"/>
       </w:pPr>
       <w:r>
-        <w:t>CR 30.02(6) requires only that a deposition notice “describe with reasonable particularity the matters on which examination is requested.” Plaintiffs’ Notice does exactly that. Each of the eighteen topics is tied to a specific aspect of UofL’s EHR systems as those systems relate to Timmi’s August 15, 2022 PET scan. UofL’s characterization of the topics as “system-wide” is overstated. Topics 1, 5, 6, 7, 8, 9, and 10 ask how UofL’s MyChart, PACS, and In-Basket systems work with respect to PET scan reports and the “acknowledgment” function. Those are the very functions that failed Timmi. Topics 11, 12, 13, 15, and 16 ask what the audit trail UofL produced actually shows, what it is missing, and how to interpret it. The information these topics seek is uniquely within UofL’s knowledge.</w:t>
+        <w:t>CR 30.02(6) requires only that a deposition notice “describe with reasonable particularity the matters on which examination is requested.” Plaintiffs’ Notice does exactly that. Each of the eighteen topics is tied to a specific aspect of UofL Defendants’ EHR systems as those systems relate to Timmi’s August 15, 2022 PET scan. UofL Defendants’ characterization of the topics as “system-wide” is overstated. Topics 1, 5, 6, 7, 8, 9, and 10 ask how UofL Defendants’ MyChart, PACS, and In-Basket systems work with respect to PET scan reports and the “acknowledgment” function. Those are the very functions that failed Timmi. Topics 11, 12, 13, 15, and 16 ask what the audit trail UofL Defendants produced actually shows, what it is missing, and how to interpret it. The information these topics seek is uniquely within UofL Defendants’ knowledge.</w:t>
       </w:r>
     </w:p>
     <w:p>
@@ -672,7 +673,7 @@
         <w:pStyle w:val="BrfBdy"/>
       </w:pPr>
       <w:r>
-        <w:t>UofL takes particular issue with Topics 2–4, 11, and 14. Those topics ask UofL whether it “admits” or “contends” certain things. For example, Topic 11 asks whether UofL contends that Dr. Gettis read the August 15, 2022 PET scan report. Topic 14 asks whether UofL contends that Dr. Aria had a responsibility to communicate the report at any time other than as he did. UofL labels these topics as improper requests for “legal conclusions.” They are not. They are requests for the facts and documents supporting positions UofL has itself taken (or may take) in this litigation. Asking a corporate defendant to identify the factual basis for its own contentions is permissible and routine. It is, in fact, one of the central purposes of CR 30.02(6). UofL cannot affirmatively contend that Dr. Gettis read the PET scan report (as the audit-trail theory of its defense necessarily implies) and at the same time argue that Plaintiffs may not ask UofL to identify the factual basis for that contention.</w:t>
+        <w:t>UofL Defendants take particular issue with Topics 2–4, 11, and 14. Those topics ask UofL Defendants whether they “admit” or “contend” certain things. For example, Topic 11 asks whether UofL Defendants contend that Dr. Gettis read the August 15, 2022 PET scan report. Topic 14 asks whether UofL Defendants contend that Dr. Aria had a responsibility to communicate the report at any time other than as he did. UofL Defendants label these topics as improper requests for “legal conclusions.” They are not. They are requests for the facts and documents supporting positions UofL Defendants have themselves taken (or may take) in this litigation. Asking a corporate defendant to identify the factual basis for its own contentions is permissible and routine. It is, in fact, one of the central purposes of CR 30.02(6). UofL Defendants cannot affirmatively contend that Dr. Gettis read the PET scan report (as the audit-trail theory of their defense necessarily implies) and at the same time argue that Plaintiffs may not ask UofL Defendants to identify the factual basis for that contention.</w:t>
       </w:r>
     </w:p>
     <w:p>
@@ -680,7 +681,7 @@
         <w:pStyle w:val="BrfBdy"/>
       </w:pPr>
       <w:r>
-        <w:t>Plaintiffs do not ask UofL’s designees to opine on “standard of care” as that term is understood under Kentucky law. To the extent any topic could be read that way, Plaintiffs are willing to clarify the topic or stipulate that it does not call for expert opinion testimony. That clarification could have been worked out in a brief phone call, had UofL chosen to make one.</w:t>
+        <w:t>Plaintiffs do not ask UofL Defendants’ designees to opine on “standard of care” as that term is understood under Kentucky law. To the extent any topic could be read that way, Plaintiffs are willing to clarify the topic or stipulate that it does not call for expert opinion testimony. That clarification could have been worked out in a brief phone call, had UofL Defendants chosen to make one.</w:t>
       </w:r>
     </w:p>
     <w:p>
@@ -688,7 +689,7 @@
         <w:pStyle w:val="BrfBdy"/>
       </w:pPr>
       <w:r>
-        <w:t>Finally, UofL objects to the so-called “catchall” language in the Notice, which states that the deposition “may cover any topics within the general knowledge of the designee(s).” This language is unremarkable. It appears in countless 30.02(6) notices in this jurisdiction. It does not convert the deposition into limitless discovery. It simply reflects the practical reality that depositions occasionally touch on related matters that arise during testimony. UofL is protected from genuine overreach by the existing rules. The catchall language alone is not a basis for a protective order.</w:t>
+        <w:t>Finally, UofL Defendants object to the so-called “catchall” language in the Notice, which states that the deposition “may cover any topics within the general knowledge of the designee(s).” This language is unremarkable. It appears in countless 30.02(6) notices in this jurisdiction. It does not convert the deposition into limitless discovery. It simply reflects the practical reality that depositions occasionally touch on related matters that arise during testimony. UofL Defendants are protected from genuine overreach by the existing rules. The catchall language alone is not a basis for a protective order.</w:t>
       </w:r>
     </w:p>
     <w:p>
@@ -700,14 +701,15 @@
           <w:b/>
           <w:u w:val="single"/>
         </w:rPr>
-        <w:t xml:space="preserve">II.	</w:t>
+        <w:t>II.</w:t>
+        <w:tab/>
       </w:r>
       <w:r>
         <w:rPr>
           <w:b/>
           <w:u w:val="single"/>
         </w:rPr>
-        <w:t xml:space="preserve">THE LIVE INSPECTION IS PROCEDURALLY PROPER AND SUBSTANTIVELY NECESSARY.</w:t>
+        <w:t>THE LIVE INSPECTION IS PROCEDURALLY PROPER AND SUBSTANTIVELY NECESSARY.</w:t>
       </w:r>
     </w:p>
     <w:p>
@@ -719,14 +721,15 @@
           <w:b/>
           <w:i/>
         </w:rPr>
-        <w:t xml:space="preserve">A.	</w:t>
+        <w:t>A.</w:t>
+        <w:tab/>
       </w:r>
       <w:r>
         <w:rPr>
           <w:b/>
           <w:i/>
         </w:rPr>
-        <w:t xml:space="preserve">The CR 34.02 timing objection fails on its face.</w:t>
+        <w:t>The CR 34.02 timing objection fails on its face.</w:t>
       </w:r>
     </w:p>
     <w:p>
@@ -734,7 +737,7 @@
         <w:pStyle w:val="BrfBdy"/>
       </w:pPr>
       <w:r>
-        <w:t>UofL asserts that the Notice runs afoul of CR 34.02’s thirty-day response period. CR 30.02(5), however, expressly authorizes a deposition notice to be “accompanied by a request made in compliance with Rule 34 for the production of documents and tangible things at the taking of the deposition.” The mechanism is built into the rule. If UofL believed it needed additional time for any portion of the inspection, the Notice expressly invited it to ask. UofL never did. It chose instead to file this Motion. In any event, Plaintiffs have always been willing to extend the inspection to a mutually convenient date, and remain willing to do so.</w:t>
+        <w:t>UofL Defendants assert that the Notice runs afoul of CR 34.02’s thirty-day response period. CR 30.02(5), however, expressly authorizes a deposition notice to be “accompanied by a request made in compliance with Rule 34 for the production of documents and tangible things at the taking of the deposition.” The mechanism is built into the rule. If UofL Defendants believed they needed additional time for any portion of the inspection, the Notice expressly invited them to ask. UofL Defendants never did. They chose instead to file this Motion. In any event, Plaintiffs have always been willing to extend the inspection to a mutually convenient date, and remain willing to do so.</w:t>
       </w:r>
     </w:p>
     <w:p>
@@ -746,14 +749,15 @@
           <w:b/>
           <w:i/>
         </w:rPr>
-        <w:t xml:space="preserve">B.	</w:t>
+        <w:t>B.</w:t>
+        <w:tab/>
       </w:r>
       <w:r>
         <w:rPr>
           <w:b/>
           <w:i/>
         </w:rPr>
-        <w:t xml:space="preserve">The actual operations of UofL’s EHR systems are squarely at issue, which is the precise circumstance in which inspection is appropriate.</w:t>
+        <w:t>The actual operations of UofL Defendants’ EHR systems are squarely at issue, which is the precise circumstance in which inspection is appropriate.</w:t>
       </w:r>
     </w:p>
     <w:p>
@@ -761,7 +765,7 @@
         <w:pStyle w:val="BrfBdy"/>
       </w:pPr>
       <w:r>
-        <w:t>The authority UofL itself cites makes the case for inspection here. The Sedona Principles recognize that direct inspection is appropriate when “the actual operation of a particular system is at issue in the litigation.” Sedona Principles, Third Edition, Comment 6.d. That is this case. The actual operation of UofL’s EHR is at the heart of how Dr. Gettis and her practice received a PET scan report consistent with cancer and yet failed to communicate that report to Timmi for nearly two years. Those operations include In-Basket routing, the “acknowledgment” function, the release of test results into MyChart, and the audit data generated by all of the above. The operation of the system also bears directly on a key open question: whether and when Dr. Gettis or anyone else at UofL actually viewed the PET scan report in Timmi’s chart prior to April 24, 2024. The audit trail UofL has produced does not answer that question. Only inspection of the live system, combined with the testimony of a knowledgeable designee, can.</w:t>
+        <w:t>The authority UofL Defendants themselves cite makes the case for inspection here. The Sedona Principles recognize that direct inspection is appropriate when “the actual operation of a particular system is at issue in the litigation.” Sedona Principles, Third Edition, Comment 6.d. That is this case. The actual operation of UofL Defendants’ EHR is at the heart of how Dr. Gettis and her practice received a PET scan report consistent with cancer and yet failed to communicate that report to Timmi for nearly two years. Those operations include In-Basket routing, the “acknowledgment” function, the release of test results into MyChart, and the audit data generated by all of the above. The operation of the system also bears directly on a key open question: whether and when Dr. Gettis or anyone else in UofL Defendants’ practice actually viewed the PET scan report in Timmi’s chart prior to April 24, 2024. The audit trail UofL Defendants have produced does not answer that question. Only inspection of the live system, combined with the testimony of a knowledgeable designee, can.</w:t>
       </w:r>
     </w:p>
     <w:p>
@@ -769,7 +773,7 @@
         <w:pStyle w:val="BrfBdy"/>
       </w:pPr>
       <w:r>
-        <w:t xml:space="preserve">The federal cases UofL relies on are inapposite. </w:t>
+        <w:t xml:space="preserve">The federal cases UofL Defendants rely on are inapposite. </w:t>
       </w:r>
       <w:r>
         <w:rPr>
@@ -796,7 +800,7 @@
         <w:t>In re Ford Motor Co.</w:t>
       </w:r>
       <w:r>
-        <w:t xml:space="preserve"> addressed a request to “conduct the actual search” of an opposing party’s files. Plaintiffs do not seek any of those things. Plaintiffs do not want to mirror UofL’s systems. Plaintiffs do not want to conduct forensic imaging. Plaintiffs do not want to rummage through UofL’s files. Plaintiffs simply ask UofL’s designees to log into Timmi’s chart, a single patient’s chart, and demonstrate by screen-sharing on Zoom how the system shows what was viewed, when, by whom, and what was done with the PET scan report. This is the least intrusive way to obtain the information at issue. It is also the way UofL’s own employees navigate the system every day.</w:t>
+        <w:t xml:space="preserve"> addressed a request to “conduct the actual search” of an opposing party’s files. Plaintiffs do not seek any of those things. Plaintiffs do not want to mirror UofL Defendants’ systems. Plaintiffs do not want to conduct forensic imaging. Plaintiffs do not want to rummage through UofL Defendants’ files. Plaintiffs simply ask UofL Defendants’ designees to log into Timmi’s chart, a single patient’s chart, and demonstrate by screen-sharing on Zoom how the system shows what was viewed, when, by whom, and what was done with the PET scan report. This is the least intrusive way to obtain the information at issue. It is also the way UofL Defendants’ own employees navigate the system every day.</w:t>
       </w:r>
     </w:p>
     <w:p>
@@ -808,14 +812,15 @@
           <w:b/>
           <w:i/>
         </w:rPr>
-        <w:t xml:space="preserve">C.	</w:t>
+        <w:t>C.</w:t>
+        <w:tab/>
       </w:r>
       <w:r>
         <w:rPr>
           <w:b/>
           <w:i/>
         </w:rPr>
-        <w:t xml:space="preserve">The audit data UofL produced is incomplete and ambiguous, and only a live inspection will resolve that.</w:t>
+        <w:t>The audit data UofL Defendants produced is incomplete and ambiguous, and only a live inspection will resolve that.</w:t>
       </w:r>
     </w:p>
     <w:p>
@@ -823,7 +828,7 @@
         <w:pStyle w:val="BrfBdy"/>
       </w:pPr>
       <w:r>
-        <w:t>The audit data UofL produced omits substantial categories of information. The missing categories include MyChart and In-Basket message content, IP address data, URLs, record-specific logging identifying which test or radiology records were accessed, print-related details, image-viewer links, and patient notifications. See Topic 12. Even the fields that were produced are written in terms whose meaning cannot be discerned without seeing the system in operation. Consider the example noted above. The audit trail records “Printing occurred in MyChart” in association with “Web page name Test Details.” UofL will likely contend that this entry means Timmi printed her PET scan report. Plaintiffs disagree. On its face, that entry could just as easily reflect the printing of an order detail page, a list of orders, or any number of other pages within MyChart. The only way for the parties, and ultimately for the Court and a jury, to know what these entries actually represent is to see what happens in the system when those entries are generated. Inspection of the live system is the most efficient way to get that answer. It is difficult to imagine what “targeted written discovery,” as UofL suggests, could substitute for the simple act of watching the system work.</w:t>
+        <w:t>The audit data UofL Defendants produced omits substantial categories of information. The missing categories include MyChart and In-Basket message content, IP address data, URLs, record-specific logging identifying which test or radiology records were accessed, print-related details, image-viewer links, and patient notifications. See Topic 12. Even the fields that were produced are written in terms whose meaning cannot be discerned without seeing the system in operation. Consider the example noted above. The audit trail records “Printing occurred in MyChart” in association with “Web page name Test Details.” UofL Defendants will likely contend that this entry means Timmi printed her PET scan report. Plaintiffs disagree. On its face, that entry could just as easily reflect the printing of an order detail page, a list of orders, or any number of other pages within MyChart. The only way for the parties, and ultimately for the Court and a jury, to know what these entries actually represent is to see what happens in the system when those entries are generated. Inspection of the live system is the most efficient way to get that answer. It is difficult to imagine what “targeted written discovery,” as UofL Defendants suggest, could substitute for the simple act of watching the system work.</w:t>
       </w:r>
     </w:p>
     <w:p>
@@ -843,14 +848,15 @@
           <w:b/>
           <w:i/>
         </w:rPr>
-        <w:t xml:space="preserve">D.	</w:t>
+        <w:t>D.</w:t>
+        <w:tab/>
       </w:r>
       <w:r>
         <w:rPr>
           <w:b/>
           <w:i/>
         </w:rPr>
-        <w:t xml:space="preserve">The UofL Defendants’ generalized HIPAA and security concerns are addressable through ordinary safeguards.</w:t>
+        <w:t>UofL Defendants’ generalized HIPAA and security concerns are addressable through ordinary safeguards.</w:t>
       </w:r>
     </w:p>
     <w:p>
@@ -858,7 +864,7 @@
         <w:pStyle w:val="BrfBdy"/>
       </w:pPr>
       <w:r>
-        <w:t>UofL invokes HIPAA, network security, and disruption to ongoing operations as reasons to forbid any live inspection. None of those concerns withstands scrutiny. Plaintiffs do not seek access to any patient record other than Timmi’s. The inspection would be conducted by a UofL designee, on a UofL workstation, with UofL counsel present, navigating only Timmi’s chart. If any third-party information were to appear incidentally (in, for example, a navigation menu), the designee could simply navigate away from it. UofL’s own staff manage these precise risks every day. UofL notably does not contend that it cannot demonstrate Timmi’s chart safely. UofL asks the Court to forbid any inspection. That is overreach.</w:t>
+        <w:t>UofL Defendants invoke HIPAA, network security, and disruption to ongoing operations as reasons to forbid any live inspection. None of those concerns withstands scrutiny. Plaintiffs do not seek access to any patient record other than Timmi’s. The inspection would be conducted by a designee of UofL Defendants, on UofL Defendants’ equipment, with UofL Defendants’ counsel present, navigating only Timmi’s chart. If any third-party information were to appear incidentally (in, for example, a navigation menu), the designee could simply navigate away from it. UofL Defendants’ own staff manage these precise risks every day. UofL Defendants notably do not contend that they cannot demonstrate Timmi’s chart safely. UofL Defendants ask the Court to forbid any inspection. That is overreach.</w:t>
       </w:r>
     </w:p>
     <w:p>
@@ -870,14 +876,15 @@
           <w:b/>
           <w:u w:val="single"/>
         </w:rPr>
-        <w:t xml:space="preserve">III.	</w:t>
+        <w:t>III.</w:t>
+        <w:tab/>
       </w:r>
       <w:r>
         <w:rPr>
           <w:b/>
           <w:u w:val="single"/>
         </w:rPr>
-        <w:t xml:space="preserve">IN THE ALTERNATIVE, IF THE COURT LIMITS THE INSPECTION, IT SHOULD LIKEWISE LIMIT THE UofL DEFENDANTS’ USE OF THE AUDIT TRAIL.</w:t>
+        <w:t>IN THE ALTERNATIVE, IF THE COURT LIMITS THE INSPECTION, IT SHOULD LIKEWISE LIMIT UofL DEFENDANTS’ USE OF THE AUDIT TRAIL.</w:t>
       </w:r>
     </w:p>
     <w:p>
@@ -885,7 +892,7 @@
         <w:pStyle w:val="BrfBdy"/>
       </w:pPr>
       <w:r>
-        <w:t>Should the Court grant UofL’s request to prohibit a live inspection, fairness requires reciprocal relief. UofL should be precluded from offering or relying on the produced audit trail, or any portion of it, in support of any contention that Timmi accessed, viewed, read, printed, or knew the substance of her August 15, 2022 PET scan report. UofL cannot withhold complete audit data, shield its EHR systems from inspection, and then ask a jury to draw inferences from selectively produced audit entries. Those inferences are not supported by the face of the produced audit data, and Plaintiffs would have no fair way to test them.</w:t>
+        <w:t>Should the Court grant UofL Defendants’ request to prohibit a live inspection, fairness requires reciprocal relief. UofL Defendants should be precluded from offering or relying on the produced audit trail, or any portion of it, in support of any contention that Timmi accessed, viewed, read, printed, or knew the substance of her August 15, 2022 PET scan report. UofL Defendants cannot withhold complete audit data, shield their EHR systems from inspection, and then ask a jury to draw inferences from selectively produced audit entries. Those inferences are not supported by the face of the produced audit data, and Plaintiffs would have no fair way to test them.</w:t>
       </w:r>
     </w:p>
     <w:p>
@@ -893,7 +900,7 @@
         <w:pStyle w:val="BrfBdy"/>
       </w:pPr>
       <w:r>
-        <w:t>This relief follows from the same principle UofL itself invokes. If the audit trail is not the sort of evidence that warrants the intrusion of an inspection, it is not the sort of evidence that should be used to support an affirmative defense premised on the deceased plaintiff’s purported awareness of her undisclosed cancer diagnosis. Plaintiffs ask the Court, in the alternative, to so order.</w:t>
+        <w:t>This relief follows from the same principle UofL Defendants themselves invoke. If the audit trail is not the sort of evidence that warrants the intrusion of an inspection, it is not the sort of evidence that should be used to support an affirmative defense premised on the deceased plaintiff’s purported awareness of her undisclosed cancer diagnosis. Plaintiffs ask the Court, in the alternative, to so order.</w:t>
       </w:r>
     </w:p>
     <w:p>
@@ -905,14 +912,15 @@
           <w:b/>
           <w:u w:val="single"/>
         </w:rPr>
-        <w:t xml:space="preserve">IV.	</w:t>
+        <w:t>IV.</w:t>
+        <w:tab/>
       </w:r>
       <w:r>
         <w:rPr>
           <w:b/>
           <w:u w:val="single"/>
         </w:rPr>
-        <w:t xml:space="preserve">THE MOTION SHOULD BE DENIED ON THE INDEPENDENT GROUND THAT THE UofL DEFENDANTS DID NOT MEET AND CONFER BEFORE FILING IT.</w:t>
+        <w:t>THE MOTION SHOULD BE DENIED ON THE INDEPENDENT GROUND THAT UofL DEFENDANTS DID NOT MEET AND CONFER BEFORE FILING IT.</w:t>
       </w:r>
     </w:p>
     <w:p>
@@ -920,7 +928,7 @@
         <w:pStyle w:val="BrfBdy"/>
       </w:pPr>
       <w:r>
-        <w:t>Discovery disputes belong in motions practice only after the parties’ good-faith efforts to resolve them have failed. Plaintiffs’ Notice expressly invited those efforts. Footnote 1 addressed scheduling. Footnote 2 addressed the substance of the topics. Plaintiffs’ counsel separately reached out following service of the Notice in the same cooperative spirit. UofL nonetheless filed this Motion without raising specific objections, proposing alternative dates, or attempting to narrow the issues for the Court. The result is the kind of unnecessary motion practice this Court has previously indicated it has little patience for.</w:t>
+        <w:t>Discovery disputes belong in motions practice only after the parties’ good-faith efforts to resolve them have failed. Plaintiffs’ Notice expressly invited those efforts. Footnote 1 addressed scheduling. Footnote 2 addressed the substance of the topics. Plaintiffs’ counsel separately reached out following service of the Notice in the same cooperative spirit. UofL Defendants nonetheless filed this Motion without raising specific objections, proposing alternative dates, or attempting to narrow the issues for the Court. The result is the kind of unnecessary motion practice this Court has previously indicated it has little patience for.</w:t>
       </w:r>
     </w:p>
     <w:p>
@@ -941,7 +949,7 @@
           <w:b/>
           <w:u w:val="single"/>
         </w:rPr>
-        <w:t xml:space="preserve">CONCLUSION</w:t>
+        <w:t>CONCLUSION</w:t>
       </w:r>
     </w:p>
     <w:p>
@@ -949,7 +957,7 @@
         <w:pStyle w:val="BrfBdy"/>
       </w:pPr>
       <w:r>
-        <w:t>For the foregoing reasons, Plaintiffs respectfully request that the Court deny UofL’s Motion for Protective Order in its entirety, and order the parties to confer in good faith and proceed with the CR 30.02(6) deposition and CR 34 inspection on a mutually convenient date. In the alternative, should the Court grant any portion of the Motion limiting the live inspection or the related audit-trail discovery, Plaintiffs request that the Court enter a corresponding Order precluding UofL from offering or relying on the produced audit trail to support any contention that Timmi viewed, read, printed, or knew the substance of her August 15, 2022 PET scan results.</w:t>
+        <w:t>For the foregoing reasons, Plaintiffs respectfully request that the Court deny UofL Defendants’ Motion for Protective Order in its entirety, and order the parties to confer in good faith and proceed with the CR 30.02(6) deposition and CR 34 inspection on a mutually convenient date. In the alternative, should the Court grant any portion of the Motion limiting the live inspection or the related audit-trail discovery, Plaintiffs request that the Court enter a corresponding Order precluding UofL Defendants from offering or relying on the produced audit trail to support any contention that Timmi viewed, read, printed, or knew the substance of her August 15, 2022 PET scan results.</w:t>
       </w:r>
     </w:p>
     <w:p>

</xml_diff>